<commit_message>
report: abstract (Özet) and keywords
Co-Authored-By: Claude Opus 5.5 <noreply@anthropic.com>
</commit_message>
<xml_diff>
--- a/docs/report/sonuc_raporu.docx
+++ b/docs/report/sonuc_raporu.docx
@@ -817,6 +817,64 @@
           <w:b/>
         </w:rPr>
       </w:pPr>
+    </w:p>
+    <w:p>
+      <w:pPr>
+        <w:keepNext/>
+        <w:spacing w:before="280" w:after="120" w:line="240" w:lineRule="auto"/>
+        <w:ind w:left="0" w:firstLine="0"/>
+        <w:jc w:val="left"/>
+      </w:pPr>
+      <w:r>
+        <w:rPr>
+          <w:rFonts w:ascii="Arial" w:hAnsi="Arial"/>
+          <w:b/>
+          <w:i w:val="0"/>
+          <w:sz w:val="24"/>
+        </w:rPr>
+        <w:t>Özet</w:t>
+      </w:r>
+    </w:p>
+    <w:p>
+      <w:pPr>
+        <w:spacing w:before="0" w:after="120" w:line="276" w:lineRule="auto"/>
+        <w:ind w:left="0" w:firstLine="0"/>
+        <w:jc w:val="both"/>
+      </w:pPr>
+      <w:r>
+        <w:rPr>
+          <w:rFonts w:ascii="Arial" w:hAnsi="Arial"/>
+          <w:b w:val="0"/>
+          <w:i w:val="0"/>
+          <w:sz w:val="22"/>
+        </w:rPr>
+        <w:t>Bu projede Borsa İstanbul'un BIST-100 evreninde her ay az sayıda hisse seçen ve her seçimi gerekçelendiren, kural tabanlı ajanlarla büyük dil modeli (LLM) ajanlarını birleştiren hibrit bir çoklu ajan sistemi geliştirilmiştir. Sistemin ilk katmanında deterministik ajanlar, hayatta kalma yanlılığından arındırılmış endeks üyeliği ve yalnızca kamuya açıklandığı tarihten sonra kullanılan finansal verilerle hisseleri tarar, filtreler ve temel güç, değerleme ve momentum-risk skorlarına göre her ay 10 aday belirler. İkinci katmanda kalite/büyüme, değer ve risk/zamanlama bakış açılarını temsil eden üç LLM jüri ajanı (yerel Qwen3.5 9B modeli), şirket adı, kod ve tarih gizlenmiş göstergelerle adayları bağımsız olarak puanlar ve gerekçelendirir; puanların ortalaması aylık üç hisselik öneriyi belirler. Sistem 2018–2024 döneminde (84 ay) işlem maliyetleri dâhil, önceden kaydedilmiş bir test düzeniyle sınanmıştır. Hibrit Top-3 portföyü yıllık %35,0 (TL) getiri sağlamış, kural tabanlı Top-3'ün (%40,8) ve eşit ağırlıklı BIST-100 ölçütünün (%44,1) gerisinde kalmıştır; aylık fark (−%0,43; t = −0,56) anlamlı değildir ve jüri seçimi 500 rastgele jüriden ayırt edilememiştir. Bu nedenle birinci hipotez (getiri üstünlüğü) desteklenmemiştir. Jüri gerekçelerinin %99,7'si yalnızca verilen göstergelere dayanmış, kararlar tekrar ve gürültü testlerinde orta ile yüksek düzeyde tutarlı bulunmuş ve ezber/sızıntı denetimlerinde modelin maskeli verilerden şirketi veya dönemi tanıyamadığı görülmüştür; bu bulgular ikinci hipotezin biçimsel bileşenlerini kısmen desteklemektedir. Proje sonunda zaman noktası doğru bir BIST veri altyapısı, açık kaynak bir yazılım ve aylık karar raporu prototipi üretilmiştir.</w:t>
+      </w:r>
+    </w:p>
+    <w:p>
+      <w:pPr>
+        <w:spacing w:before="0" w:after="120" w:line="276" w:lineRule="auto"/>
+        <w:ind w:left="0" w:firstLine="0"/>
+        <w:jc w:val="both"/>
+      </w:pPr>
+      <w:r>
+        <w:rPr>
+          <w:rFonts w:ascii="Arial" w:hAnsi="Arial"/>
+          <w:b/>
+          <w:i w:val="0"/>
+          <w:sz w:val="22"/>
+        </w:rPr>
+        <w:t>Anahtar kelimeler:</w:t>
+      </w:r>
+      <w:r>
+        <w:rPr>
+          <w:rFonts w:ascii="Arial" w:hAnsi="Arial"/>
+          <w:b w:val="0"/>
+          <w:i w:val="0"/>
+          <w:sz w:val="22"/>
+        </w:rPr>
+        <w:t xml:space="preserve"> çoklu ajan sistemi, büyük dil modeli, hisse seçimi, Borsa İstanbul, geriye dönük test, açıklanabilirlik</w:t>
+      </w:r>
     </w:p>
     <w:p>
       <w:pPr>

</xml_diff>